<commit_message>
docs: replace text-sign diagrams with high-resolution visual flow images and AI infographic across all docx files
</commit_message>
<xml_diff>
--- a/docx/admin_integration.docx
+++ b/docx/admin_integration.docx
@@ -257,7 +257,7 @@
           <w:color w:val="1B4D20"/>
           <w:sz w:val="32"/>
         </w:rPr>
-        <w:t>2. Navigation Integration &amp; Authentication Route Guards</w:t>
+        <w:t>2. Navigation Integration &amp; Authentication Route Architecture</w:t>
       </w:r>
     </w:p>
     <w:p>
@@ -270,7 +270,62 @@
           <w:color w:val="1E293B"/>
           <w:sz w:val="20"/>
         </w:rPr>
-        <w:t>The Admin Portal has been seamlessly woven into the public information architecture:</w:t>
+        <w:t>The Admin Portal has been seamlessly woven into the public information architecture. The diagram below illustrates how authentication routes dispatch users securely into their respective role boundaries:</w:t>
+      </w:r>
+    </w:p>
+    <w:p>
+      <w:pPr>
+        <w:spacing w:before="160" w:after="60"/>
+        <w:jc w:val="center"/>
+      </w:pPr>
+      <w:r>
+        <w:drawing>
+          <wp:inline xmlns:a="http://schemas.openxmlformats.org/drawingml/2006/main" xmlns:pic="http://schemas.openxmlformats.org/drawingml/2006/picture">
+            <wp:extent cx="5669280" cy="3569547"/>
+            <wp:docPr id="1" name="Picture 1"/>
+            <wp:cNvGraphicFramePr>
+              <a:graphicFrameLocks noChangeAspect="1"/>
+            </wp:cNvGraphicFramePr>
+            <a:graphic>
+              <a:graphicData uri="http://schemas.openxmlformats.org/drawingml/2006/picture">
+                <pic:pic>
+                  <pic:nvPicPr>
+                    <pic:cNvPr id="0" name="flow_sitemap_hierarchy.png"/>
+                    <pic:cNvPicPr/>
+                  </pic:nvPicPr>
+                  <pic:blipFill>
+                    <a:blip r:embed="rId11"/>
+                    <a:stretch>
+                      <a:fillRect/>
+                    </a:stretch>
+                  </pic:blipFill>
+                  <pic:spPr>
+                    <a:xfrm>
+                      <a:off x="0" y="0"/>
+                      <a:ext cx="5669280" cy="3569547"/>
+                    </a:xfrm>
+                    <a:prstGeom prst="rect"/>
+                  </pic:spPr>
+                </pic:pic>
+              </a:graphicData>
+            </a:graphic>
+          </wp:inline>
+        </w:drawing>
+      </w:r>
+    </w:p>
+    <w:p>
+      <w:pPr>
+        <w:spacing w:before="0" w:after="240"/>
+        <w:jc w:val="center"/>
+      </w:pPr>
+      <w:r>
+        <w:rPr>
+          <w:rFonts w:ascii="Calibri" w:hAnsi="Calibri"/>
+          <w:i/>
+          <w:color w:val="64748B"/>
+          <w:sz w:val="17"/>
+        </w:rPr>
+        <w:t>Figure: Administrator and Role Authentication Routing Architecture</w:t>
       </w:r>
     </w:p>
     <w:p>
@@ -341,73 +396,6 @@
         </w:rPr>
         <w:t>Auth Guarding (js/auth.js): Any attempt by non-admin users (farmers, customers, drivers, wholesalers) to access admin/* triggers immediate interception and rerouting.</w:t>
       </w:r>
-    </w:p>
-    <w:tbl>
-      <w:tblPr>
-        <w:tblW w:type="auto" w:w="0"/>
-        <w:jc w:val="center"/>
-        <w:tblLayout w:type="fixed"/>
-        <w:tblLook w:firstColumn="1" w:firstRow="1" w:lastColumn="0" w:lastRow="0" w:noHBand="0" w:noVBand="1" w:val="04A0"/>
-      </w:tblPr>
-      <w:tblGrid>
-        <w:gridCol w:w="9360"/>
-      </w:tblGrid>
-      <w:tr>
-        <w:tc>
-          <w:tcPr>
-            <w:tcW w:type="dxa" w:w="9360"/>
-            <w:shd w:fill="0F172A"/>
-            <w:tcMar>
-              <w:top w:w="140" w:type="dxa"/>
-              <w:bottom w:w="140" w:type="dxa"/>
-              <w:left w:w="180" w:type="dxa"/>
-              <w:right w:w="180" w:type="dxa"/>
-            </w:tcMar>
-          </w:tcPr>
-          <w:p>
-            <w:pPr>
-              <w:spacing w:before="0" w:after="80"/>
-            </w:pPr>
-            <w:r>
-              <w:rPr>
-                <w:rFonts w:ascii="Consolas" w:hAnsi="Consolas"/>
-                <w:b/>
-                <w:color w:val="38BDF8"/>
-                <w:sz w:val="17"/>
-              </w:rPr>
-              <w:t>ARCHITECTURE FLOW DIAGRAM: Client-Side Route Authorization Engine</w:t>
-              <w:br/>
-            </w:r>
-            <w:r>
-              <w:rPr>
-                <w:rFonts w:ascii="Consolas" w:hAnsi="Consolas"/>
-                <w:color w:val="F1F5F9"/>
-                <w:sz w:val="16"/>
-              </w:rPr>
-              <w:t>// js/auth.js - Stakeholder Redirection Matrix</w:t>
-              <w:br/>
-              <w:t>const roleRoutes = {</w:t>
-              <w:br/>
-              <w:t xml:space="preserve">    admin:      'admin/dashboard.html',</w:t>
-              <w:br/>
-              <w:t xml:space="preserve">    farmer:     'farmer/dashboard.html',</w:t>
-              <w:br/>
-              <w:t xml:space="preserve">    wholesaler: 'wholesaler/dashboard.html',</w:t>
-              <w:br/>
-              <w:t xml:space="preserve">    driver:     'driver/dashboard.html',</w:t>
-              <w:br/>
-              <w:t xml:space="preserve">    customer:   'customer/products.html'</w:t>
-              <w:br/>
-              <w:t>};</w:t>
-            </w:r>
-          </w:p>
-        </w:tc>
-      </w:tr>
-    </w:tbl>
-    <w:p>
-      <w:pPr>
-        <w:spacing w:after="120"/>
-      </w:pPr>
     </w:p>
     <w:p>
       <w:pPr>
@@ -591,7 +579,7 @@
         <w:drawing>
           <wp:inline xmlns:a="http://schemas.openxmlformats.org/drawingml/2006/main" xmlns:pic="http://schemas.openxmlformats.org/drawingml/2006/picture">
             <wp:extent cx="5486400" cy="4114800"/>
-            <wp:docPr id="1" name="Picture 1"/>
+            <wp:docPr id="2" name="Picture 2"/>
             <wp:cNvGraphicFramePr>
               <a:graphicFrameLocks noChangeAspect="1"/>
             </wp:cNvGraphicFramePr>
@@ -603,7 +591,7 @@
                     <pic:cNvPicPr/>
                   </pic:nvPicPr>
                   <pic:blipFill>
-                    <a:blip r:embed="rId11"/>
+                    <a:blip r:embed="rId12"/>
                     <a:stretch>
                       <a:fillRect/>
                     </a:stretch>
@@ -743,7 +731,7 @@
         <w:drawing>
           <wp:inline xmlns:a="http://schemas.openxmlformats.org/drawingml/2006/main" xmlns:pic="http://schemas.openxmlformats.org/drawingml/2006/picture">
             <wp:extent cx="5486400" cy="4114800"/>
-            <wp:docPr id="2" name="Picture 2"/>
+            <wp:docPr id="3" name="Picture 3"/>
             <wp:cNvGraphicFramePr>
               <a:graphicFrameLocks noChangeAspect="1"/>
             </wp:cNvGraphicFramePr>
@@ -755,7 +743,7 @@
                     <pic:cNvPicPr/>
                   </pic:nvPicPr>
                   <pic:blipFill>
-                    <a:blip r:embed="rId12"/>
+                    <a:blip r:embed="rId13"/>
                     <a:stretch>
                       <a:fillRect/>
                     </a:stretch>
@@ -918,7 +906,7 @@
         <w:drawing>
           <wp:inline xmlns:a="http://schemas.openxmlformats.org/drawingml/2006/main" xmlns:pic="http://schemas.openxmlformats.org/drawingml/2006/picture">
             <wp:extent cx="5486400" cy="4114800"/>
-            <wp:docPr id="3" name="Picture 3"/>
+            <wp:docPr id="4" name="Picture 4"/>
             <wp:cNvGraphicFramePr>
               <a:graphicFrameLocks noChangeAspect="1"/>
             </wp:cNvGraphicFramePr>
@@ -930,7 +918,7 @@
                     <pic:cNvPicPr/>
                   </pic:nvPicPr>
                   <pic:blipFill>
-                    <a:blip r:embed="rId13"/>
+                    <a:blip r:embed="rId14"/>
                     <a:stretch>
                       <a:fillRect/>
                     </a:stretch>

</xml_diff>

<commit_message>
docs: generate human-designed diagram images in docx/images and embed in all 6 docx files, removing AI slop
</commit_message>
<xml_diff>
--- a/docx/admin_integration.docx
+++ b/docx/admin_integration.docx
@@ -257,7 +257,7 @@
           <w:color w:val="1B4D20"/>
           <w:sz w:val="32"/>
         </w:rPr>
-        <w:t>2. Navigation Integration &amp; Authentication Route Architecture</w:t>
+        <w:t>2. Navigation Integration &amp; Multi-Module Security Architecture</w:t>
       </w:r>
     </w:p>
     <w:p>
@@ -270,7 +270,7 @@
           <w:color w:val="1E293B"/>
           <w:sz w:val="20"/>
         </w:rPr>
-        <w:t>The Admin Portal has been seamlessly woven into the public information architecture. The diagram below illustrates how authentication routes dispatch users securely into their respective role boundaries:</w:t>
+        <w:t>The Admin Portal has been seamlessly integrated into the platform architecture. The diagram below illustrates how administrator governance encompasses all platform modules and role boundaries:</w:t>
       </w:r>
     </w:p>
     <w:p>
@@ -281,7 +281,7 @@
       <w:r>
         <w:drawing>
           <wp:inline xmlns:a="http://schemas.openxmlformats.org/drawingml/2006/main" xmlns:pic="http://schemas.openxmlformats.org/drawingml/2006/picture">
-            <wp:extent cx="5669280" cy="3569547"/>
+            <wp:extent cx="5669280" cy="3644537"/>
             <wp:docPr id="1" name="Picture 1"/>
             <wp:cNvGraphicFramePr>
               <a:graphicFrameLocks noChangeAspect="1"/>
@@ -290,7 +290,7 @@
               <a:graphicData uri="http://schemas.openxmlformats.org/drawingml/2006/picture">
                 <pic:pic>
                   <pic:nvPicPr>
-                    <pic:cNvPr id="0" name="flow_sitemap_hierarchy.png"/>
+                    <pic:cNvPr id="0" name="04_admin_governance_architecture.png"/>
                     <pic:cNvPicPr/>
                   </pic:nvPicPr>
                   <pic:blipFill>
@@ -302,7 +302,7 @@
                   <pic:spPr>
                     <a:xfrm>
                       <a:off x="0" y="0"/>
-                      <a:ext cx="5669280" cy="3569547"/>
+                      <a:ext cx="5669280" cy="3644537"/>
                     </a:xfrm>
                     <a:prstGeom prst="rect"/>
                   </pic:spPr>
@@ -325,7 +325,7 @@
           <w:color w:val="64748B"/>
           <w:sz w:val="17"/>
         </w:rPr>
-        <w:t>Figure: Administrator and Role Authentication Routing Architecture</w:t>
+        <w:t>Figure: Administrator Governance &amp; Multi-Module Security Architecture Diagram</w:t>
       </w:r>
     </w:p>
     <w:p>

</xml_diff>